<commit_message>
v2.3 instructions: tips for the current mechanics, retro price trend, memory
- Tips: weak spots (x3) make each weapon decisive at a third of the places; Gurus are
  needed for the rich places; Killer Disks hit at full force in the first round.
- The retro price slowly rises for a player who sells now and then (simulated), not level.
- Memory: about 5.6 KB (5433 bytes + variables).

Co-Authored-By: Claude Opus 5.5 <noreply@anthropic.com>
Claude-Session: https://claude.ai/code/session_014MnrG7cc1Hws3poqmcDFnM
</commit_message>
<xml_diff>
--- a/instructions_v2.3.docx
+++ b/instructions_v2.3.docx
@@ -323,7 +323,7 @@
         <w:rPr>
           <w:lang w:val="en-GB"/>
         </w:rPr>
-        <w:t xml:space="preserve"> with a RAM module (CE-151 or larger). The recording holds the program without its REM lines (5433 bytes); with its variables it needs about 5.9 KB of memory, so it does not fit into a PC-1500 or PC-2 without a module.</w:t>
+        <w:t xml:space="preserve"> with a RAM module (CE-151 or larger). The recording holds the program without its REM lines (5433 bytes); with its variables it needs about 5.6 KB of memory, so it does not fit into a PC-1500 or PC-2 without a module.</w:t>
       </w:r>
     </w:p>
     <w:p>
@@ -5711,7 +5711,7 @@
         <w:rPr>
           <w:lang w:val="en-GB"/>
         </w:rPr>
-        <w:t xml:space="preserve">The price of retro stuff is 475 gold at the start of the game. After every fight it rises by 0, 50 or 100 gold (at random); every sale of retro stuff lowers it by 0 to 250 gold, but never below 250. On average over a game the price stays level: whoever sells often pushes it down, whoever waits sees it rise. Hackers and Gurus sell for less than they cost. You cannot sell your last people: the game shows </w:t>
+        <w:t xml:space="preserve">The price of retro stuff is 475 gold at the start of the game. After every fight it rises by 0, 50 or 100 gold (at random); every sale of retro stuff lowers it by 0 to 250 gold, but never below 250. Over a game the price slowly rises for a player who sells now and then; whoever sells after every fight pushes it down. Hackers and Gurus sell for less than they cost. You cannot sell your last people: the game shows </w:t>
       </w:r>
       <w:r>
         <w:rPr>
@@ -6057,7 +6057,7 @@
         <w:rPr>
           <w:lang w:val="en-GB"/>
         </w:rPr>
-        <w:t xml:space="preserve">Gurus are expensive and mighty, and they fight again in every following fight – but they are no miracle workers. Do not let them be outnumbered: when more than 10 Tech Priests per Guru are left after your Killer Disks and API keys, they fall fast.</w:t>
+        <w:t xml:space="preserve">Gurus are expensive and mighty, and they fight again in every following fight: without them you will hardly take the rich places. But they are no miracle workers – do not let them be outnumbered: when more than 10 Tech Priests per Guru are left after your Killer Disks and API keys, they fall fast.</w:t>
       </w:r>
     </w:p>
     <w:p>
@@ -6076,7 +6076,26 @@
         <w:rPr>
           <w:lang w:val="en-GB"/>
         </w:rPr>
-        <w:t xml:space="preserve">Use the weak spots: buy the weapon the next places are weak to, and at a place weak to Gurus let them do the heavy work.</w:t>
+        <w:t xml:space="preserve">Killer Disks get through the firewalls: in the first round, when your other attacks are still weak, they hit with full force. Bring enough Hackers to run them before the Tech Priests strike back.</w:t>
+      </w:r>
+    </w:p>
+    <w:p>
+      <w:pPr>
+        <w:pStyle w:val="Akapitzlist"/>
+        <w:numPr>
+          <w:ilvl w:val="0"/>
+          <w:numId w:val="2"/>
+        </w:numPr>
+        <w:spacing w:after="60"/>
+        <w:rPr>
+          <w:lang w:val="en-GB"/>
+        </w:rPr>
+      </w:pPr>
+      <w:r>
+        <w:rPr>
+          <w:lang w:val="en-GB"/>
+        </w:rPr>
+        <w:t xml:space="preserve">Use the weak spots: the weapon a place is weak to hits three times as hard there. Each of your three weapons decides a third of the places – rich ones too – so keep a stock of Killer Disks, API keys and Gurus, and check the next places’ weak spots before you buy.</w:t>
       </w:r>
     </w:p>
     <w:p>

</xml_diff>

<commit_message>
v2.3: place screen DEFENDED BY ... PRIESTS / FEARFUL OF ..., instructions, new recording
- Place screen texts and the doubled display time (WAIT 120) from the listing edited on
  GitHub; instructions and README describe FEARFUL OF HACKERS/GHOSTS/GURUS (the
  weak spot is named after the people of your team).
- Fix: treasure "Commodore C64 + color CRT" (25 characters) overflowed L$(0) * 26 once ".."
  is appended at game over; now "Commodore C64 + CRT".
- 5449 bytes; new recording.

Co-Authored-By: Claude Sonnet 5.5 <noreply@anthropic.com>
Claude-Session: https://claude.ai/code/session_014MnrG7cc1Hws3poqmcDFnM
</commit_message>
<xml_diff>
--- a/instructions_v2.3.docx
+++ b/instructions_v2.3.docx
@@ -323,7 +323,7 @@
         <w:rPr>
           <w:lang w:val="en-GB"/>
         </w:rPr>
-        <w:t xml:space="preserve"> with a RAM module (CE-151 or larger). The recording holds the program without its REM lines (5433 bytes); with its variables it needs about 5.6 KB of memory, so it does not fit into a PC-1500 or PC-2 without a module.</w:t>
+        <w:t xml:space="preserve"> with a RAM module (CE-151 or larger). The recording holds the program without its REM lines (5449 bytes); with its variables it needs about 5.6 KB of memory, so it does not fit into a PC-1500 or PC-2 without a module.</w:t>
       </w:r>
     </w:p>
     <w:p>
@@ -3694,20 +3694,46 @@
         <w:rPr>
           <w:lang w:val="en-GB"/>
         </w:rPr>
-        <w:t xml:space="preserve"> Every place is weak to one of your weapons: Killer Disks, API keys or Gurus. When you choose a place, the game shows it, e.g. </w:t>
+        <w:t xml:space="preserve"> Every place is weak to one of your weapons, and the game tells you whom it fears: </w:t>
       </w:r>
       <w:r>
         <w:rPr>
           <w:rFonts w:ascii="Courier New" w:eastAsia="Courier New" w:hAnsi="Courier New" w:cs="Courier New"/>
           <w:lang w:val="en-GB"/>
         </w:rPr>
-        <w:t xml:space="preserve">WEAK TO KEYS</w:t>
-      </w:r>
-      <w:r>
-        <w:rPr>
-          <w:lang w:val="en-GB"/>
-        </w:rPr>
-        <w:t xml:space="preserve">. There, the hits of that weapon count three times. The weak spots follow the places in a fixed order – disks, keys, Gurus, disks, keys … – but where the order starts is drawn anew in every game: once you know the weak spot of one place, you know them all. Plan your purchases for the next places.</w:t>
+        <w:t xml:space="preserve">FEARFUL OF HACKERS</w:t>
+      </w:r>
+      <w:r>
+        <w:rPr>
+          <w:lang w:val="en-GB"/>
+        </w:rPr>
+        <w:t xml:space="preserve"> – the Killer Disks of your Hackers, </w:t>
+      </w:r>
+      <w:r>
+        <w:rPr>
+          <w:rFonts w:ascii="Courier New" w:eastAsia="Courier New" w:hAnsi="Courier New" w:cs="Courier New"/>
+          <w:lang w:val="en-GB"/>
+        </w:rPr>
+        <w:t xml:space="preserve">FEARFUL OF GHOSTS</w:t>
+      </w:r>
+      <w:r>
+        <w:rPr>
+          <w:lang w:val="en-GB"/>
+        </w:rPr>
+        <w:t xml:space="preserve"> – the API keys of your Ghosts, or </w:t>
+      </w:r>
+      <w:r>
+        <w:rPr>
+          <w:rFonts w:ascii="Courier New" w:eastAsia="Courier New" w:hAnsi="Courier New" w:cs="Courier New"/>
+          <w:lang w:val="en-GB"/>
+        </w:rPr>
+        <w:t xml:space="preserve">FEARFUL OF GURUS</w:t>
+      </w:r>
+      <w:r>
+        <w:rPr>
+          <w:lang w:val="en-GB"/>
+        </w:rPr>
+        <w:t xml:space="preserve">. There, the hits of that weapon count three times. The weak spots follow the places in a fixed order – Hackers, Ghosts, Gurus, Hackers, Ghosts … – but where the order starts is drawn anew in every game: once you know the weak spot of one place, you know them all. Plan your purchases for the next places.</w:t>
       </w:r>
     </w:p>
     <w:p>
@@ -3840,14 +3866,27 @@
         <w:rPr>
           <w:lang w:val="en-GB"/>
         </w:rPr>
-        <w:t xml:space="preserve">The game shows the place, its Tech Priests, its retro stuff and gold, and its weak spot, e.g. </w:t>
+        <w:t xml:space="preserve">The game shows the place, how many Tech Priests defend it, e.g. </w:t>
       </w:r>
       <w:r>
         <w:rPr>
           <w:rFonts w:ascii="Courier New" w:eastAsia="Courier New" w:hAnsi="Courier New" w:cs="Courier New"/>
           <w:lang w:val="en-GB"/>
         </w:rPr>
-        <w:t xml:space="preserve">WEAK TO K-DISKS</w:t>
+        <w:t xml:space="preserve">DEFENDED BY 50 PRIESTS</w:t>
+      </w:r>
+      <w:r>
+        <w:rPr>
+          <w:lang w:val="en-GB"/>
+        </w:rPr>
+        <w:t xml:space="preserve">, its retro stuff and gold, and whom it fears, e.g. </w:t>
+      </w:r>
+      <w:r>
+        <w:rPr>
+          <w:rFonts w:ascii="Courier New" w:eastAsia="Courier New" w:hAnsi="Courier New" w:cs="Courier New"/>
+          <w:lang w:val="en-GB"/>
+        </w:rPr>
+        <w:t xml:space="preserve">FEARFUL OF HACKERS</w:t>
       </w:r>
       <w:r>
         <w:rPr>

</xml_diff>